<commit_message>
Fix: Descarga directa PDF con html2pdf, eliminacion de datos autogenerados, correccion de proporcion vertical Flor de Lis y bordes unificados
</commit_message>
<xml_diff>
--- a/public/programa_assets/Programa_Template.docx
+++ b/public/programa_assets/Programa_Template.docx
@@ -6287,7 +6287,7 @@
           <wp:positionV relativeFrom="margin">
             <wp:align>center</wp:align>
           </wp:positionV>
-          <wp:extent cx="6856730" cy="3856990"/>
+          <wp:extent cx="4600000" cy="5290000"/>
           <wp:effectExtent l="0" t="0" r="0" b="0"/>
           <wp:wrapNone/>
           <wp:docPr id="1" name="Imagen 4"/>
@@ -6320,7 +6320,7 @@
                 <pic:spPr bwMode="auto">
                   <a:xfrm>
                     <a:off x="0" y="0"/>
-                    <a:ext cx="6856730" cy="3856990"/>
+                    <a:ext cx="4600000" cy="5290000"/>
                   </a:xfrm>
                   <a:prstGeom prst="rect">
                     <a:avLst/>
@@ -6369,7 +6369,7 @@
           <wp:positionV relativeFrom="margin">
             <wp:align>center</wp:align>
           </wp:positionV>
-          <wp:extent cx="6856730" cy="3856990"/>
+          <wp:extent cx="4600000" cy="5290000"/>
           <wp:effectExtent l="0" t="0" r="0" b="0"/>
           <wp:wrapNone/>
           <wp:docPr id="2" name="Imagen 3"/>
@@ -6402,7 +6402,7 @@
                 <pic:spPr bwMode="auto">
                   <a:xfrm>
                     <a:off x="0" y="0"/>
-                    <a:ext cx="6856730" cy="3856990"/>
+                    <a:ext cx="4600000" cy="5290000"/>
                   </a:xfrm>
                   <a:prstGeom prst="rect">
                     <a:avLst/>
@@ -6519,7 +6519,7 @@
           <wp:positionV relativeFrom="margin">
             <wp:align>center</wp:align>
           </wp:positionV>
-          <wp:extent cx="6856730" cy="3856990"/>
+          <wp:extent cx="4600000" cy="5290000"/>
           <wp:effectExtent l="0" t="0" r="0" b="0"/>
           <wp:wrapNone/>
           <wp:docPr id="5" name="Imagen 1"/>
@@ -6552,7 +6552,7 @@
                 <pic:spPr bwMode="auto">
                   <a:xfrm>
                     <a:off x="0" y="0"/>
-                    <a:ext cx="6856730" cy="3856990"/>
+                    <a:ext cx="4600000" cy="5290000"/>
                   </a:xfrm>
                   <a:prstGeom prst="rect">
                     <a:avLst/>

</xml_diff>

<commit_message>
Fix: Banners sin bordes blancos, logos centrados en una sola fila en Word (identico al PDF) y renderizado PDF en escala 3 (300 DPI)
</commit_message>
<xml_diff>
--- a/public/programa_assets/Programa_Template.docx
+++ b/public/programa_assets/Programa_Template.docx
@@ -40,149 +40,10 @@
     </w:p>
     <w:p>
       <w:pPr>
-        <w:keepNext/>
-        <w:framePr w:dropCap="drop" w:lines="3" w:wrap="around" w:vAnchor="text" w:hAnchor="text"/>
-        <w:spacing w:line="914" w:lineRule="exact"/>
         <w:jc w:val="center"/>
-        <w:textAlignment w:val="baseline"/>
-        <w:rPr>
-          <w:position w:val="-12"/>
-          <w:lang w:eastAsia="es-VE"/>
-        </w:rPr>
+        <w:spacing w:before="60" w:after="80"/>
       </w:pPr>
       <w:r>
-        <w:rPr>
-          <w:noProof/>
-          <w:position w:val="-12"/>
-          <w:lang w:eastAsia="es-VE"/>
-        </w:rPr>
-        <w:drawing>
-          <wp:inline distT="0" distB="0" distL="0" distR="0" wp14:anchorId="079E1BAF" wp14:editId="0DC787FA">
-            <wp:extent cx="632460" cy="525780"/>
-            <wp:effectExtent l="0" t="0" r="0" b="0"/>
-            <wp:docPr id="1334939696" name="Imagen 1" descr="No hay texto alternativo automático disponible."/>
-            <wp:cNvGraphicFramePr>
-              <a:graphicFrameLocks xmlns:a="http://schemas.openxmlformats.org/drawingml/2006/main" noChangeAspect="1"/>
-            </wp:cNvGraphicFramePr>
-            <a:graphic xmlns:a="http://schemas.openxmlformats.org/drawingml/2006/main">
-              <a:graphicData uri="http://schemas.openxmlformats.org/drawingml/2006/picture">
-                <pic:pic xmlns:pic="http://schemas.openxmlformats.org/drawingml/2006/picture">
-                  <pic:nvPicPr>
-                    <pic:cNvPr id="0" name="Picture 1" descr="No hay texto alternativo automático disponible."/>
-                    <pic:cNvPicPr>
-                      <a:picLocks noChangeAspect="1" noChangeArrowheads="1"/>
-                    </pic:cNvPicPr>
-                  </pic:nvPicPr>
-                  <pic:blipFill>
-                    <a:blip r:embed="rId7">
-                      <a:extLst>
-                        <a:ext uri="{28A0092B-C50C-407E-A947-70E740481C1C}">
-                          <a14:useLocalDpi xmlns:a14="http://schemas.microsoft.com/office/drawing/2010/main" val="0"/>
-                        </a:ext>
-                      </a:extLst>
-                    </a:blip>
-                    <a:srcRect/>
-                    <a:stretch>
-                      <a:fillRect/>
-                    </a:stretch>
-                  </pic:blipFill>
-                  <pic:spPr bwMode="auto">
-                    <a:xfrm>
-                      <a:off x="0" y="0"/>
-                      <a:ext cx="632460" cy="525780"/>
-                    </a:xfrm>
-                    <a:prstGeom prst="rect">
-                      <a:avLst/>
-                    </a:prstGeom>
-                    <a:noFill/>
-                    <a:ln>
-                      <a:noFill/>
-                    </a:ln>
-                  </pic:spPr>
-                </pic:pic>
-              </a:graphicData>
-            </a:graphic>
-          </wp:inline>
-        </w:drawing>
-      </w:r>
-    </w:p>
-    <w:p>
-      <w:pPr>
-        <w:jc w:val="both"/>
-        <w:rPr>
-          <w:rFonts w:ascii="Tw Cen MT" w:hAnsi="Tw Cen MT" w:cs="Arial"/>
-          <w:b/>
-          <w:color w:val="000000"/>
-          <w:sz w:val="28"/>
-          <w:szCs w:val="22"/>
-          <w:lang w:eastAsia="es-VE"/>
-        </w:rPr>
-      </w:pPr>
-      <w:r>
-        <w:rPr>
-          <w:rFonts w:ascii="Tw Cen MT" w:hAnsi="Tw Cen MT" w:cs="Arial"/>
-          <w:b/>
-          <w:color w:val="000000"/>
-          <w:sz w:val="28"/>
-          <w:szCs w:val="22"/>
-          <w:lang w:eastAsia="es-VE"/>
-        </w:rPr>
-        <w:t xml:space="preserve">                                  </w:t>
-      </w:r>
-      <w:r>
-        <w:rPr>
-          <w:rFonts w:ascii="Tw Cen MT" w:hAnsi="Tw Cen MT" w:cs="Arial"/>
-          <w:b/>
-          <w:color w:val="000000"/>
-          <w:sz w:val="28"/>
-          <w:szCs w:val="22"/>
-          <w:lang w:eastAsia="es-VE"/>
-        </w:rPr>
-        <w:t xml:space="preserve">                      </w:t>
-      </w:r>
-      <w:r>
-        <w:rPr>
-          <w:rFonts w:ascii="Tw Cen MT" w:hAnsi="Tw Cen MT" w:cs="Arial"/>
-          <w:b/>
-          <w:color w:val="000000"/>
-          <w:sz w:val="28"/>
-          <w:szCs w:val="22"/>
-          <w:lang w:eastAsia="es-VE"/>
-        </w:rPr>
-        <w:t xml:space="preserve">             </w:t>
-      </w:r>
-      <w:r>
-        <w:rPr>
-          <w:rFonts w:ascii="Tw Cen MT" w:hAnsi="Tw Cen MT" w:cs="Arial"/>
-          <w:b/>
-          <w:color w:val="000000"/>
-          <w:sz w:val="28"/>
-          <w:szCs w:val="22"/>
-          <w:lang w:eastAsia="es-VE"/>
-        </w:rPr>
-        <w:t xml:space="preserve"> </w:t>
-      </w:r>
-      <w:r>
-        <w:rPr>
-          <w:rFonts w:ascii="Tw Cen MT" w:hAnsi="Tw Cen MT" w:cs="Arial"/>
-          <w:b/>
-          <w:color w:val="000000"/>
-          <w:sz w:val="28"/>
-          <w:szCs w:val="22"/>
-          <w:lang w:eastAsia="es-VE"/>
-        </w:rPr>
-        <w:t xml:space="preserve">  </w:t>
-      </w:r>
-      <w:r>
-        <w:rPr>
-          <w:rFonts w:ascii="Tw Cen MT" w:hAnsi="Tw Cen MT" w:cs="Arial"/>
-          <w:b/>
-          <w:noProof/>
-          <w:color w:val="000000"/>
-          <w:sz w:val="28"/>
-          <w:szCs w:val="22"/>
-          <w:lang w:eastAsia="es-VE"/>
-        </w:rPr>
         <w:drawing>
           <wp:inline distT="0" distB="0" distL="0" distR="0" wp14:anchorId="5798CDA8" wp14:editId="44185072">
             <wp:extent cx="487680" cy="480060"/>
@@ -233,26 +94,9 @@
         </w:drawing>
       </w:r>
       <w:r>
-        <w:rPr>
-          <w:rFonts w:ascii="Tw Cen MT" w:hAnsi="Tw Cen MT" w:cs="Arial"/>
-          <w:b/>
-          <w:color w:val="000000"/>
-          <w:sz w:val="28"/>
-          <w:szCs w:val="22"/>
-          <w:lang w:eastAsia="es-VE"/>
-        </w:rPr>
-        <w:t xml:space="preserve">  </w:t>
+        <w:t xml:space="preserve">   </w:t>
       </w:r>
       <w:r>
-        <w:rPr>
-          <w:rFonts w:ascii="Tw Cen MT" w:hAnsi="Tw Cen MT" w:cs="Arial"/>
-          <w:b/>
-          <w:noProof/>
-          <w:color w:val="000000"/>
-          <w:sz w:val="28"/>
-          <w:szCs w:val="22"/>
-          <w:lang w:eastAsia="es-VE"/>
-        </w:rPr>
         <w:drawing>
           <wp:inline distT="0" distB="0" distL="0" distR="0" wp14:anchorId="1C169201" wp14:editId="4A290033">
             <wp:extent cx="342900" cy="495300"/>
@@ -303,26 +147,62 @@
         </w:drawing>
       </w:r>
       <w:r>
-        <w:rPr>
-          <w:rFonts w:ascii="Tw Cen MT" w:hAnsi="Tw Cen MT" w:cs="Arial"/>
-          <w:b/>
-          <w:color w:val="000000"/>
-          <w:sz w:val="28"/>
-          <w:szCs w:val="22"/>
-          <w:lang w:eastAsia="es-VE"/>
-        </w:rPr>
-        <w:t xml:space="preserve">  </w:t>
+        <w:t xml:space="preserve">   </w:t>
       </w:r>
       <w:r>
-        <w:rPr>
-          <w:rFonts w:ascii="Tw Cen MT" w:hAnsi="Tw Cen MT" w:cs="Arial"/>
-          <w:b/>
-          <w:noProof/>
-          <w:color w:val="000000"/>
-          <w:sz w:val="28"/>
-          <w:szCs w:val="22"/>
-          <w:lang w:eastAsia="es-VE"/>
-        </w:rPr>
+        <w:drawing>
+          <wp:inline distT="0" distB="0" distL="0" distR="0" wp14:anchorId="079E1BAF" wp14:editId="0DC787FA">
+            <wp:extent cx="632460" cy="525780"/>
+            <wp:effectExtent l="0" t="0" r="0" b="0"/>
+            <wp:docPr id="1334939696" name="Imagen 1" descr="No hay texto alternativo automático disponible."/>
+            <wp:cNvGraphicFramePr>
+              <a:graphicFrameLocks xmlns:a="http://schemas.openxmlformats.org/drawingml/2006/main" noChangeAspect="1"/>
+            </wp:cNvGraphicFramePr>
+            <a:graphic xmlns:a="http://schemas.openxmlformats.org/drawingml/2006/main">
+              <a:graphicData uri="http://schemas.openxmlformats.org/drawingml/2006/picture">
+                <pic:pic xmlns:pic="http://schemas.openxmlformats.org/drawingml/2006/picture">
+                  <pic:nvPicPr>
+                    <pic:cNvPr id="0" name="Picture 1" descr="No hay texto alternativo automático disponible."/>
+                    <pic:cNvPicPr>
+                      <a:picLocks noChangeAspect="1" noChangeArrowheads="1"/>
+                    </pic:cNvPicPr>
+                  </pic:nvPicPr>
+                  <pic:blipFill>
+                    <a:blip r:embed="rId7">
+                      <a:extLst>
+                        <a:ext uri="{28A0092B-C50C-407E-A947-70E740481C1C}">
+                          <a14:useLocalDpi xmlns:a14="http://schemas.microsoft.com/office/drawing/2010/main" val="0"/>
+                        </a:ext>
+                      </a:extLst>
+                    </a:blip>
+                    <a:srcRect/>
+                    <a:stretch>
+                      <a:fillRect/>
+                    </a:stretch>
+                  </pic:blipFill>
+                  <pic:spPr bwMode="auto">
+                    <a:xfrm>
+                      <a:off x="0" y="0"/>
+                      <a:ext cx="632460" cy="525780"/>
+                    </a:xfrm>
+                    <a:prstGeom prst="rect">
+                      <a:avLst/>
+                    </a:prstGeom>
+                    <a:noFill/>
+                    <a:ln>
+                      <a:noFill/>
+                    </a:ln>
+                  </pic:spPr>
+                </pic:pic>
+              </a:graphicData>
+            </a:graphic>
+          </wp:inline>
+        </w:drawing>
+      </w:r>
+      <w:r>
+        <w:t xml:space="preserve">   </w:t>
+      </w:r>
+      <w:r>
         <w:drawing>
           <wp:inline distT="0" distB="0" distL="0" distR="0" wp14:anchorId="28EC0063" wp14:editId="777A5629">
             <wp:extent cx="1485900" cy="388620"/>
@@ -371,6 +251,9 @@
             </a:graphic>
           </wp:inline>
         </w:drawing>
+      </w:r>
+      <w:r>
+        <w:t xml:space="preserve">   </w:t>
       </w:r>
     </w:p>
     <w:p>

</xml_diff>